<commit_message>
requirements: Welle 4/5 Anforderungen v2.0 + Berater-Feedback
- Zielgruppe geschärft: KMU-Büros statt Freelancer, Marktgröße 22.800+ EEE-Experten
- Wettbewerbsanalyse ergänzt: Warum Hottgenroth/IBO/ETU die Lücke nicht schließen
- Welle 5 neu priorisiert: Kundenportal-Login entfernt, Digitales Kundenformular + E-Mail stattdessen
- Qualitätsmerkmale aufgenommen: KI-Plausibilitätsprüfung + Geführte Dokumentenerfassung (Backlog)
- Neues Anforderungsdokument v2.0 (welle-4-5-v2.md + Word)
- Berater-Feedback Praczka & Pinneger dokumentiert (MD + Word)
</commit_message>
<xml_diff>
--- a/requirements/Anforderungsdokument_Energieberater_Welle4-5.docx
+++ b/requirements/Anforderungsdokument_Energieberater_Welle4-5.docx
@@ -2,7 +2,7 @@
 <file path=word/document.xml><?xml version="1.0" encoding="utf-8"?>
 <w:document xmlns:w="http://schemas.openxmlformats.org/wordprocessingml/2006/main" xmlns:m="http://schemas.openxmlformats.org/officeDocument/2006/math" xmlns:r="http://schemas.openxmlformats.org/officeDocument/2006/relationships" xmlns:o="urn:schemas-microsoft-com:office:office" xmlns:v="urn:schemas-microsoft-com:vml" xmlns:w10="urn:schemas-microsoft-com:office:word" xmlns:a="http://schemas.openxmlformats.org/drawingml/2006/main" xmlns:pic="http://schemas.openxmlformats.org/drawingml/2006/picture" xmlns:wp="http://schemas.openxmlformats.org/drawingml/2006/wordprocessingDrawing">
   <w:body>
-    <w:bookmarkStart w:id="27" w:name="anforderungsdokument-app-energieberater"/>
+    <w:bookmarkStart w:id="22" w:name="anforderungsdokument-app-energieberater"/>
     <w:p>
       <w:pPr>
         <w:pStyle w:val="Heading1"/>
@@ -42,6 +42,22 @@
           <w:b/>
           <w:bCs/>
         </w:rPr>
+        <w:t xml:space="preserve">Aktualisiert:</w:t>
+      </w:r>
+      <w:r>
+        <w:t xml:space="preserve"> </w:t>
+      </w:r>
+      <w:r>
+        <w:t xml:space="preserve">01. April 2026</w:t>
+      </w:r>
+      <w:r>
+        <w:br/>
+      </w:r>
+      <w:r>
+        <w:rPr>
+          <w:b/>
+          <w:bCs/>
+        </w:rPr>
         <w:t xml:space="preserve">Autor:</w:t>
       </w:r>
       <w:r>
@@ -64,7 +80,7 @@
         <w:t xml:space="preserve"> </w:t>
       </w:r>
       <w:r>
-        <w:t xml:space="preserve">1.0</w:t>
+        <w:t xml:space="preserve">2.0</w:t>
       </w:r>
       <w:r>
         <w:br/>
@@ -100,6 +116,48 @@
       </w:r>
     </w:p>
     <w:p>
+      <w:pPr>
+        <w:pStyle w:val="BlockText"/>
+      </w:pPr>
+      <w:r>
+        <w:rPr>
+          <w:b/>
+          <w:bCs/>
+        </w:rPr>
+        <w:t xml:space="preserve">Änderungshistorie v2.0:</w:t>
+      </w:r>
+      <w:r>
+        <w:t xml:space="preserve"> </w:t>
+      </w:r>
+      <w:r>
+        <w:t xml:space="preserve">Zielgruppe geschärft (Berater-Feedback + Waleri-Review), Welle 5 neu priorisiert (kein Kundenportal-Login), Marktgröße und Wettbewerbsanalyse ergänzt, Qualitätsmerkmal</w:t>
+      </w:r>
+      <w:r>
+        <w:t xml:space="preserve"> </w:t>
+      </w:r>
+      <w:r>
+        <w:t xml:space="preserve">“KI-geprüfte Erfassung”</w:t>
+      </w:r>
+      <w:r>
+        <w:t xml:space="preserve"> </w:t>
+      </w:r>
+      <w:r>
+        <w:t xml:space="preserve">+</w:t>
+      </w:r>
+      <w:r>
+        <w:t xml:space="preserve"> </w:t>
+      </w:r>
+      <w:r>
+        <w:t xml:space="preserve">“Geführte Dokumentenerfassung”</w:t>
+      </w:r>
+      <w:r>
+        <w:t xml:space="preserve"> </w:t>
+      </w:r>
+      <w:r>
+        <w:t xml:space="preserve">aufgenommen.</w:t>
+      </w:r>
+    </w:p>
+    <w:p>
       <w:r>
         <w:pict>
           <v:rect style="width:0;height:1.5pt" o:hralign="center" o:hrstd="t" o:hr="t"/>
@@ -158,7 +216,7 @@
         <w:t xml:space="preserve"> </w:t>
       </w:r>
       <w:r>
-        <w:t xml:space="preserve">Die App unterstützt freiberufliche Energieberater bei der digitalen Abbildung ihres gesamten Beratungsprozesses — von der Vor-Ort-Gebäudeerfassung über die Förderprüfung bis zur Kommunikation mit dem Kunden. Kunden erhalten einen eigenen Portalzugang, um Projektstatus und Dokumente einzusehen. Langfristiges Ziel ist eine End-to-End-Plattform, die Digitalisierungslücken im deutschen Energieberatungsmarkt schließt.</w:t>
+        <w:t xml:space="preserve">Die App unterstützt kleine und mittelständische Energieberatungsbüros sowie qualifizierte Fachbetriebe bei der digitalen Abbildung ihres gesamten Beratungsprozesses — von der mobilen Vor-Ort-Gebäudeerfassung über die Förderprüfung bis zur Kundenkommunikation. Sie schließt die Lücke zwischen reiner Berechnungssoftware (Hottgenroth, IBO, ETU) und einem vollständigen Prozessmanagement-Werkzeug. Langfristiges Ziel ist die erste End-to-End-Plattform im deutschen Energieberatungsmarkt.</w:t>
       </w:r>
     </w:p>
     <w:p>
@@ -176,12 +234,80 @@
         <w:t xml:space="preserve"> </w:t>
       </w:r>
       <w:r>
-        <w:t xml:space="preserve">Freiberufliche Energieberater und kleine Energieberatungsbüros (B2B), primär in Deutschland.</w:t>
+        <w:t xml:space="preserve">Kleine und mittelständische Energieberatungsbüros (GbR, GmbH) sowie qualifizierte Fachbetriebe (Architekten, Ingenieurbüros, Handwerksbetriebe mit Energieberatungszulassung), primär in Deutschland. Marktgröße:</w:t>
+      </w:r>
+      <w:r>
+        <w:t xml:space="preserve"> </w:t>
+      </w:r>
+      <w:r>
+        <w:rPr>
+          <w:b/>
+          <w:bCs/>
+        </w:rPr>
+        <w:t xml:space="preserve">22.800+ registrierte Energie-Effizienz-Experten</w:t>
+      </w:r>
+      <w:r>
+        <w:t xml:space="preserve"> </w:t>
+      </w:r>
+      <w:r>
+        <w:t xml:space="preserve">(dena EEE-Liste, Stand März 2026) — ein klar definierter, regulierter B2B-Markt mit nachgewiesenem Wachstum durch GEG und BEG-Förderung.</w:t>
       </w:r>
     </w:p>
     <w:p>
       <w:pPr>
         <w:pStyle w:val="BodyText"/>
+      </w:pPr>
+      <w:r>
+        <w:rPr>
+          <w:b/>
+          <w:bCs/>
+        </w:rPr>
+        <w:t xml:space="preserve">Endkunden-Demografie (Zielgruppe der Berater):</w:t>
+      </w:r>
+      <w:r>
+        <w:t xml:space="preserve"> </w:t>
+      </w:r>
+      <w:r>
+        <w:t xml:space="preserve">Die Endkunden der Energieberater sind zu ~80% Hausbesitzer über 40 Jahre (Gebäude aus den 70er–90er Jahren, jetzt in der Sanierungsphase für die Rente). Diese Gruppe ist digital wenig affin, bevorzugt persönlichen Kontakt (Telefon, vor Ort) und lehnt Self-Service-Portale sowie KI-Assistenten ab. Investitionsvolumen: 50.000–100.000 € je Sanierungsmaßnahme. Nur ~20% der Endkunden sind unter 40 und digital affin.</w:t>
+      </w:r>
+    </w:p>
+    <w:p>
+      <w:pPr>
+        <w:pStyle w:val="BlockText"/>
+      </w:pPr>
+      <w:r>
+        <w:rPr>
+          <w:b/>
+          <w:bCs/>
+        </w:rPr>
+        <w:t xml:space="preserve">Konsequenz für die App:</w:t>
+      </w:r>
+      <w:r>
+        <w:t xml:space="preserve"> </w:t>
+      </w:r>
+      <w:r>
+        <w:t xml:space="preserve">Digitale Features müssen primär den</w:t>
+      </w:r>
+      <w:r>
+        <w:t xml:space="preserve"> </w:t>
+      </w:r>
+      <w:r>
+        <w:rPr>
+          <w:b/>
+          <w:bCs/>
+        </w:rPr>
+        <w:t xml:space="preserve">Berater</w:t>
+      </w:r>
+      <w:r>
+        <w:t xml:space="preserve"> </w:t>
+      </w:r>
+      <w:r>
+        <w:t xml:space="preserve">entlasten — kein Zwang zu digitalem Self-Service für Endkunden.</w:t>
+      </w:r>
+    </w:p>
+    <w:p>
+      <w:pPr>
+        <w:pStyle w:val="FirstParagraph"/>
       </w:pPr>
       <w:r>
         <w:rPr>
@@ -194,12 +320,82 @@
         <w:t xml:space="preserve"> </w:t>
       </w:r>
       <w:r>
-        <w:t xml:space="preserve">Bestehende Softwarelösungen decken nur Teilbereiche ab (Berechnungssoftware, iSFP-Erstellung). Es existiert keine End-to-End-Plattform, die den gesamten Prozess — Vor-Ort-Erfassung, Förder-Navigator, Kundenportal und Projektkommunikation — digital in einer Anwendung abbildet.</w:t>
+        <w:t xml:space="preserve">Bestehende Softwarelösungen decken nur Teilbereiche ab — und das aus einem strukturellen Grund: Berechnungssoftware (Hottgenroth, IBO, ETU — Marktführer seit den 1990ern) ist auf normkonforme Physik-Engines optimiert, desktop-basiert, hochkomplex und nicht für den mobilen Außendienst geeignet. Prozessmanagement (CRM, mobiles Erfassungsformular, Kundenkommunikation, Förder-Navigator) wurde nie Teil dieser Tools, weil es eine völlig andere Produktkategorie ist. Diese Lücke — zwischen Berechnung und Prozess — ist die Marktchance: Es existiert keine End-to-End-Plattform, die mobile Vor-Ort-Erfassung, Förderprüfung und Projektkommunikation in einer modernen Webanwendung verbindet.</w:t>
       </w:r>
     </w:p>
     <w:p>
       <w:pPr>
         <w:pStyle w:val="BodyText"/>
+      </w:pPr>
+      <w:r>
+        <w:rPr>
+          <w:b/>
+          <w:bCs/>
+        </w:rPr>
+        <w:t xml:space="preserve">Qualitätsmerkmal &amp; Differenzierung:</w:t>
+      </w:r>
+      <w:r>
+        <w:t xml:space="preserve"> </w:t>
+      </w:r>
+      <w:r>
+        <w:t xml:space="preserve">Die App differenziert sich durch zwei Alleinstellungsmerkmale, die kein bestehender Wettbewerber bietet:</w:t>
+      </w:r>
+    </w:p>
+    <w:p>
+      <w:pPr>
+        <w:numPr>
+          <w:ilvl w:val="0"/>
+          <w:numId w:val="1001"/>
+        </w:numPr>
+      </w:pPr>
+      <w:r>
+        <w:rPr>
+          <w:b/>
+          <w:bCs/>
+        </w:rPr>
+        <w:t xml:space="preserve">KI-geprüfte Gebäudeerfassung</w:t>
+      </w:r>
+      <w:r>
+        <w:t xml:space="preserve"> </w:t>
+      </w:r>
+      <w:r>
+        <w:t xml:space="preserve">— Nach der Vor-Ort-Erfassung prüft eine KI die eingetragenen Gebäudedaten automatisch auf Vollständigkeit, Plausibilität und GEG-Konformität. Widersprüche (z.B. Baujahr 1975 + Wärmepumpe als Bestandsheizung) und fehlende Pflichtfelder werden vor Abschluss markiert. Ergebnis: Fehler werden vor der Berechnung gefunden — nicht danach.</w:t>
+      </w:r>
+    </w:p>
+    <w:p>
+      <w:pPr>
+        <w:numPr>
+          <w:ilvl w:val="0"/>
+          <w:numId w:val="1001"/>
+        </w:numPr>
+      </w:pPr>
+      <w:r>
+        <w:rPr>
+          <w:b/>
+          <w:bCs/>
+        </w:rPr>
+        <w:t xml:space="preserve">Geführte Dokumentenerfassung</w:t>
+      </w:r>
+      <w:r>
+        <w:t xml:space="preserve"> </w:t>
+      </w:r>
+      <w:r>
+        <w:t xml:space="preserve">— Kunden wissen oft nicht, welche Unterlagen für BAFA/KfW benötigt werden, und sind mit dem Einreichen überfordert (Scannen, Dateiformat, Benennung). Die App löst das: Der Berater legt pro Projekt eine förderungsspezifische Dokumenten-Checkliste an. Der Kunde erhält einen einfachen Link mit Schritt-für-Schritt-Anleitung und Fortschrittsanzeige (</w:t>
+      </w:r>
+      <w:r>
+        <w:rPr>
+          <w:i/>
+          <w:iCs/>
+        </w:rPr>
+        <w:t xml:space="preserve">“3 von 5 Unterlagen eingereicht”</w:t>
+      </w:r>
+      <w:r>
+        <w:t xml:space="preserve">). Eine KI prüft, ob das hochgeladene Dokument dem erwarteten Typ entspricht. Der Berater sieht auf einen Blick, was noch fehlt — kein WhatsApp-Chaos mehr.</w:t>
+      </w:r>
+    </w:p>
+    <w:p>
+      <w:pPr>
+        <w:pStyle w:val="FirstParagraph"/>
       </w:pPr>
       <w:r>
         <w:rPr>
@@ -247,7 +443,7 @@
         <w:t xml:space="preserve"> </w:t>
       </w:r>
       <w:r>
-        <w:t xml:space="preserve">Authentifizierung, Berater-Dashboard, GEG-Begehungsformular, Foto-Upload, Förder-Navigator, Kundenportal, Fristenkalender, Projektstatus-Kommunikation, Landingpage.</w:t>
+        <w:t xml:space="preserve">Authentifizierung, Berater-Dashboard, GEG-Begehungsformular, Foto-Upload, Förder-Navigator, Fristenkalender, Projektstatus-Kommunikation per E-Mail, Digitales Kundenformular, Landingpage.</w:t>
       </w:r>
     </w:p>
     <w:p>
@@ -1462,7 +1658,7 @@
       </w:r>
     </w:p>
     <w:bookmarkEnd w:id="15"/>
-    <w:bookmarkStart w:id="16" w:name="welle-5-navigator-kundenportal"/>
+    <w:bookmarkStart w:id="16" w:name="welle-5-navigator-kommunikation"/>
     <w:p>
       <w:pPr>
         <w:pStyle w:val="Heading2"/>
@@ -1474,7 +1670,7 @@
         <w:t xml:space="preserve"> </w:t>
       </w:r>
       <w:r>
-        <w:t xml:space="preserve">“Navigator &amp; Kundenportal”</w:t>
+        <w:t xml:space="preserve">“Navigator &amp; Kommunikation”</w:t>
       </w:r>
     </w:p>
     <w:p>
@@ -1524,7 +1720,7 @@
         <w:t xml:space="preserve"> </w:t>
       </w:r>
       <w:r>
-        <w:t xml:space="preserve">Förder-Navigator, Kundenportal, Projektkommunikation, Landingpage-Erweiterung</w:t>
+        <w:t xml:space="preserve">Förder-Navigator, Digitales Kundenformular, Projektkommunikation, Landingpage-Erweiterung</w:t>
       </w:r>
     </w:p>
     <w:p>
@@ -1542,7 +1738,25 @@
         <w:t xml:space="preserve"> </w:t>
       </w:r>
       <w:r>
-        <w:t xml:space="preserve">Berater erfasst Gebäudedaten → Förder-Navigator zeigt passende Programme → Berater sendet Ergebnis an Kunden → Kunde loggt sich ins Portal ein und sieht Projektstatus ✅</w:t>
+        <w:t xml:space="preserve">Berater schickt Kunden Formular-Link → Kunde füllt Stammdaten/Gebäudedaten aus → Daten fließen ins Projekt → Förder-Navigator zeigt passende Programme → Berater sendet Status-E-Mail an Kunden ✅</w:t>
+      </w:r>
+    </w:p>
+    <w:p>
+      <w:pPr>
+        <w:pStyle w:val="BlockText"/>
+      </w:pPr>
+      <w:r>
+        <w:rPr>
+          <w:b/>
+          <w:bCs/>
+        </w:rPr>
+        <w:t xml:space="preserve">Scope-Entscheidung:</w:t>
+      </w:r>
+      <w:r>
+        <w:t xml:space="preserve"> </w:t>
+      </w:r>
+      <w:r>
+        <w:t xml:space="preserve">Kundenportal mit Login entfernt — 80% der Endkunden sind über 40 und digital wenig affin. Ersetzt durch digitales Kundenformular (kein Login nötig) und E-Mail-Benachrichtigung. Geführte Dokumentenerfassung und KI-Prüfung sind im Backlog als nächste Ausbaustufe geplant.</w:t>
       </w:r>
     </w:p>
     <w:tbl>
@@ -1630,29 +1844,29 @@
                 <w:b/>
                 <w:bCs/>
               </w:rPr>
-              <w:t xml:space="preserve">Kundenportal</w:t>
-            </w:r>
-          </w:p>
-        </w:tc>
-        <w:tc>
-          <w:tcPr/>
-          <w:p>
-            <w:pPr>
-              <w:pStyle w:val="Compact"/>
-            </w:pPr>
-            <w:r>
-              <w:t xml:space="preserve">Separater Kunden-Login, Projektstatus-Ansicht (read-only)</w:t>
-            </w:r>
-          </w:p>
-        </w:tc>
-        <w:tc>
-          <w:tcPr/>
-          <w:p>
-            <w:pPr>
-              <w:pStyle w:val="Compact"/>
-            </w:pPr>
-            <w:r>
-              <w:t xml:space="preserve">4</w:t>
+              <w:t xml:space="preserve">Digitales Kundenformular</w:t>
+            </w:r>
+          </w:p>
+        </w:tc>
+        <w:tc>
+          <w:tcPr/>
+          <w:p>
+            <w:pPr>
+              <w:pStyle w:val="Compact"/>
+            </w:pPr>
+            <w:r>
+              <w:t xml:space="preserve">Webbasiertes Stammdaten- und Gebäudedaten-Formular — Berater schickt Kunden einen Link, Kunde füllt aus, Daten fließen direkt ins Projekt (kein Kunden-Login erforderlich)</w:t>
+            </w:r>
+          </w:p>
+        </w:tc>
+        <w:tc>
+          <w:tcPr/>
+          <w:p>
+            <w:pPr>
+              <w:pStyle w:val="Compact"/>
+            </w:pPr>
+            <w:r>
+              <w:t xml:space="preserve">3</w:t>
             </w:r>
           </w:p>
         </w:tc>
@@ -1666,56 +1880,6 @@
             </w:pPr>
             <w:r>
               <w:t xml:space="preserve">2</w:t>
-            </w:r>
-          </w:p>
-        </w:tc>
-        <w:tc>
-          <w:tcPr/>
-          <w:p>
-            <w:pPr>
-              <w:pStyle w:val="Compact"/>
-            </w:pPr>
-            <w:r>
-              <w:rPr>
-                <w:b/>
-                <w:bCs/>
-              </w:rPr>
-              <w:t xml:space="preserve">Kunden-Dokumenten-Upload</w:t>
-            </w:r>
-          </w:p>
-        </w:tc>
-        <w:tc>
-          <w:tcPr/>
-          <w:p>
-            <w:pPr>
-              <w:pStyle w:val="Compact"/>
-            </w:pPr>
-            <w:r>
-              <w:t xml:space="preserve">Upload von Energierechnungen und Bauplänen durch den Kunden</w:t>
-            </w:r>
-          </w:p>
-        </w:tc>
-        <w:tc>
-          <w:tcPr/>
-          <w:p>
-            <w:pPr>
-              <w:pStyle w:val="Compact"/>
-            </w:pPr>
-            <w:r>
-              <w:t xml:space="preserve">1,5</w:t>
-            </w:r>
-          </w:p>
-        </w:tc>
-      </w:tr>
-      <w:tr>
-        <w:tc>
-          <w:tcPr/>
-          <w:p>
-            <w:pPr>
-              <w:pStyle w:val="Compact"/>
-            </w:pPr>
-            <w:r>
-              <w:t xml:space="preserve">3</w:t>
             </w:r>
           </w:p>
         </w:tc>
@@ -1765,7 +1929,7 @@
               <w:pStyle w:val="Compact"/>
             </w:pPr>
             <w:r>
-              <w:t xml:space="preserve">4</w:t>
+              <w:t xml:space="preserve">3</w:t>
             </w:r>
           </w:p>
         </w:tc>
@@ -1815,7 +1979,7 @@
               <w:pStyle w:val="Compact"/>
             </w:pPr>
             <w:r>
-              <w:t xml:space="preserve">5</w:t>
+              <w:t xml:space="preserve">4</w:t>
             </w:r>
           </w:p>
         </w:tc>
@@ -1841,18 +2005,68 @@
               <w:pStyle w:val="Compact"/>
             </w:pPr>
             <w:r>
-              <w:t xml:space="preserve">Berater → Kunde: In-App-Notification + E-Mail (via Resend)</w:t>
-            </w:r>
-          </w:p>
-        </w:tc>
-        <w:tc>
-          <w:tcPr/>
-          <w:p>
-            <w:pPr>
-              <w:pStyle w:val="Compact"/>
-            </w:pPr>
-            <w:r>
-              <w:t xml:space="preserve">2,5</w:t>
+              <w:t xml:space="preserve">Berater → Kunde: E-Mail-Benachrichtigung (via Resend) — kein Kunden-Login, kein Portal</w:t>
+            </w:r>
+          </w:p>
+        </w:tc>
+        <w:tc>
+          <w:tcPr/>
+          <w:p>
+            <w:pPr>
+              <w:pStyle w:val="Compact"/>
+            </w:pPr>
+            <w:r>
+              <w:t xml:space="preserve">2</w:t>
+            </w:r>
+          </w:p>
+        </w:tc>
+      </w:tr>
+      <w:tr>
+        <w:tc>
+          <w:tcPr/>
+          <w:p>
+            <w:pPr>
+              <w:pStyle w:val="Compact"/>
+            </w:pPr>
+            <w:r>
+              <w:t xml:space="preserve">5</w:t>
+            </w:r>
+          </w:p>
+        </w:tc>
+        <w:tc>
+          <w:tcPr/>
+          <w:p>
+            <w:pPr>
+              <w:pStyle w:val="Compact"/>
+            </w:pPr>
+            <w:r>
+              <w:rPr>
+                <w:b/>
+                <w:bCs/>
+              </w:rPr>
+              <w:t xml:space="preserve">PDF-Download-Bereich (Website)</w:t>
+            </w:r>
+          </w:p>
+        </w:tc>
+        <w:tc>
+          <w:tcPr/>
+          <w:p>
+            <w:pPr>
+              <w:pStyle w:val="Compact"/>
+            </w:pPr>
+            <w:r>
+              <w:t xml:space="preserve">Downloadbereich auf Landingpage: standardisierte Formulare (Energieausweis-Datenblatt, Kundenformular als PDF) zum Download</w:t>
+            </w:r>
+          </w:p>
+        </w:tc>
+        <w:tc>
+          <w:tcPr/>
+          <w:p>
+            <w:pPr>
+              <w:pStyle w:val="Compact"/>
+            </w:pPr>
+            <w:r>
+              <w:t xml:space="preserve">1</w:t>
             </w:r>
           </w:p>
         </w:tc>
@@ -1941,18 +2155,18 @@
               <w:pStyle w:val="Compact"/>
             </w:pPr>
             <w:r>
-              <w:t xml:space="preserve">E2E-Durchlauf (Berater → Förder-Navigator → Kundenportal), Test im Livesystem</w:t>
-            </w:r>
-          </w:p>
-        </w:tc>
-        <w:tc>
-          <w:tcPr/>
-          <w:p>
-            <w:pPr>
-              <w:pStyle w:val="Compact"/>
-            </w:pPr>
-            <w:r>
-              <w:t xml:space="preserve">0,75</w:t>
+              <w:t xml:space="preserve">E2E-Durchlauf (Berater → Kundenformular → Förder-Navigator → Status-E-Mail), Test im Livesystem</w:t>
+            </w:r>
+          </w:p>
+        </w:tc>
+        <w:tc>
+          <w:tcPr/>
+          <w:p>
+            <w:pPr>
+              <w:pStyle w:val="Compact"/>
+            </w:pPr>
+            <w:r>
+              <w:t xml:space="preserve">1,5</w:t>
             </w:r>
           </w:p>
         </w:tc>
@@ -1991,18 +2205,18 @@
               <w:pStyle w:val="Compact"/>
             </w:pPr>
             <w:r>
-              <w:t xml:space="preserve">Integration neuer Welle-5-Features in die bestehende Landingpage</w:t>
-            </w:r>
-          </w:p>
-        </w:tc>
-        <w:tc>
-          <w:tcPr/>
-          <w:p>
-            <w:pPr>
-              <w:pStyle w:val="Compact"/>
-            </w:pPr>
-            <w:r>
-              <w:t xml:space="preserve">0,25</w:t>
+              <w:t xml:space="preserve">Integration neuer Welle-5-Features + PDF-Downloads in die bestehende Landingpage</w:t>
+            </w:r>
+          </w:p>
+        </w:tc>
+        <w:tc>
+          <w:tcPr/>
+          <w:p>
+            <w:pPr>
+              <w:pStyle w:val="Compact"/>
+            </w:pPr>
+            <w:r>
+              <w:t xml:space="preserve">1</w:t>
             </w:r>
           </w:p>
         </w:tc>
@@ -2100,7 +2314,7 @@
                 <w:b/>
                 <w:bCs/>
               </w:rPr>
-              <w:t xml:space="preserve">16</w:t>
+              <w:t xml:space="preserve">~15,5</w:t>
             </w:r>
           </w:p>
         </w:tc>
@@ -2360,7 +2574,7 @@
         <w:pStyle w:val="Compact"/>
         <w:numPr>
           <w:ilvl w:val="0"/>
-          <w:numId w:val="1001"/>
+          <w:numId w:val="1002"/>
         </w:numPr>
       </w:pPr>
       <w:r>
@@ -2397,7 +2611,7 @@
         <w:pStyle w:val="Compact"/>
         <w:numPr>
           <w:ilvl w:val="0"/>
-          <w:numId w:val="1001"/>
+          <w:numId w:val="1002"/>
         </w:numPr>
       </w:pPr>
       <w:r>
@@ -2419,7 +2633,7 @@
         <w:pStyle w:val="Compact"/>
         <w:numPr>
           <w:ilvl w:val="0"/>
-          <w:numId w:val="1001"/>
+          <w:numId w:val="1002"/>
         </w:numPr>
       </w:pPr>
       <w:r>
@@ -2441,7 +2655,7 @@
         <w:pStyle w:val="Compact"/>
         <w:numPr>
           <w:ilvl w:val="0"/>
-          <w:numId w:val="1001"/>
+          <w:numId w:val="1002"/>
         </w:numPr>
       </w:pPr>
       <w:r>
@@ -3126,6 +3340,73 @@
           </w:p>
         </w:tc>
       </w:tr>
+      <w:tr>
+        <w:tc>
+          <w:tcPr/>
+          <w:p>
+            <w:pPr>
+              <w:pStyle w:val="Compact"/>
+            </w:pPr>
+            <w:r>
+              <w:t xml:space="preserve">R9</w:t>
+            </w:r>
+          </w:p>
+        </w:tc>
+        <w:tc>
+          <w:tcPr/>
+          <w:p>
+            <w:pPr>
+              <w:pStyle w:val="Compact"/>
+            </w:pPr>
+            <w:r>
+              <w:rPr>
+                <w:b/>
+                <w:bCs/>
+              </w:rPr>
+              <w:t xml:space="preserve">Kundenformular-Akzeptanz</w:t>
+            </w:r>
+            <w:r>
+              <w:t xml:space="preserve"> </w:t>
+            </w:r>
+            <w:r>
+              <w:t xml:space="preserve">— Endkunden (&gt;40 Jahre) füllen das Online-Formular nicht aus und schicken stattdessen unstrukturierte E-Mails/Bilder</w:t>
+            </w:r>
+          </w:p>
+        </w:tc>
+        <w:tc>
+          <w:tcPr/>
+          <w:p>
+            <w:pPr>
+              <w:pStyle w:val="Compact"/>
+            </w:pPr>
+            <w:r>
+              <w:t xml:space="preserve">Hoch</w:t>
+            </w:r>
+          </w:p>
+        </w:tc>
+        <w:tc>
+          <w:tcPr/>
+          <w:p>
+            <w:pPr>
+              <w:pStyle w:val="Compact"/>
+            </w:pPr>
+            <w:r>
+              <w:t xml:space="preserve">Mittel</w:t>
+            </w:r>
+          </w:p>
+        </w:tc>
+        <w:tc>
+          <w:tcPr/>
+          <w:p>
+            <w:pPr>
+              <w:pStyle w:val="Compact"/>
+            </w:pPr>
+            <w:r>
+              <w:t xml:space="preserve">Formular so einfach wie möglich halten (max. 10 Felder), Fallback: PDF-Download zum Ausdrucken und per Post/Scan einreichen</w:t>
+            </w:r>
+          </w:p>
+        </w:tc>
+      </w:tr>
     </w:tbl>
     <w:p>
       <w:r>
@@ -3301,7 +3582,7 @@
               <w:pStyle w:val="Compact"/>
             </w:pPr>
             <w:r>
-              <w:t xml:space="preserve">Gebäudedaten → Förder-Navigator → Ergebnis an Kunden → Kundenportal Projektstatus ✅</w:t>
+              <w:t xml:space="preserve">Kundenformular → Daten ins Projekt → Förder-Navigator → Status-E-Mail an Kunden ✅</w:t>
             </w:r>
           </w:p>
         </w:tc>
@@ -3333,13 +3614,13 @@
       </w:r>
     </w:p>
     <w:bookmarkEnd w:id="20"/>
-    <w:bookmarkStart w:id="22" w:name="X1aba14a0b7d1ebb10bd58dc9142dfd2b015fd32"/>
+    <w:bookmarkStart w:id="21" w:name="bewusst-ausgeklammert-backlog"/>
     <w:p>
       <w:pPr>
         <w:pStyle w:val="Heading2"/>
       </w:pPr>
       <w:r>
-        <w:t xml:space="preserve">13. Bewusst ausgeklammert — Backlog für zukünftige Wellen</w:t>
+        <w:t xml:space="preserve">13. Bewusst ausgeklammert — Backlog</w:t>
       </w:r>
     </w:p>
     <w:tbl>
@@ -3350,10 +3631,9 @@
         <w:tblLook w:firstRow="1" w:lastRow="0" w:firstColumn="0" w:lastColumn="0" w:noHBand="0" w:noVBand="0" w:val="0020"/>
       </w:tblPr>
       <w:tblGrid>
-        <w:gridCol w:w="1980"/>
-        <w:gridCol w:w="1980"/>
-        <w:gridCol w:w="1980"/>
-        <w:gridCol w:w="1980"/>
+        <w:gridCol w:w="2640"/>
+        <w:gridCol w:w="2640"/>
+        <w:gridCol w:w="2640"/>
       </w:tblGrid>
       <w:tr>
         <w:trPr>
@@ -3392,14 +3672,198 @@
             </w:r>
           </w:p>
         </w:tc>
-        <w:tc>
-          <w:tcPr/>
-          <w:p>
-            <w:pPr>
-              <w:pStyle w:val="Compact"/>
-            </w:pPr>
-            <w:r>
-              <w:t xml:space="preserve">Empfohlene Welle</w:t>
+      </w:tr>
+      <w:tr>
+        <w:tc>
+          <w:tcPr/>
+          <w:p>
+            <w:pPr>
+              <w:pStyle w:val="Compact"/>
+            </w:pPr>
+            <w:r>
+              <w:rPr>
+                <w:b/>
+                <w:bCs/>
+              </w:rPr>
+              <w:t xml:space="preserve">KI-Plausibilitätsprüfung Gebäudeerfassung</w:t>
+            </w:r>
+          </w:p>
+        </w:tc>
+        <w:tc>
+          <w:tcPr/>
+          <w:p>
+            <w:pPr>
+              <w:pStyle w:val="Compact"/>
+            </w:pPr>
+            <w:r>
+              <w:t xml:space="preserve">KI prüft nach Vor-Ort-Erfassung automatisch auf Vollständigkeit, Plausibilität und GEG-Konformität — markiert Widersprüche und fehlende Pflichtfelder vor Formularabschluss</w:t>
+            </w:r>
+          </w:p>
+        </w:tc>
+        <w:tc>
+          <w:tcPr/>
+          <w:p>
+            <w:pPr>
+              <w:pStyle w:val="Compact"/>
+            </w:pPr>
+            <w:r>
+              <w:t xml:space="preserve">~4h</w:t>
+            </w:r>
+          </w:p>
+        </w:tc>
+      </w:tr>
+      <w:tr>
+        <w:tc>
+          <w:tcPr/>
+          <w:p>
+            <w:pPr>
+              <w:pStyle w:val="Compact"/>
+            </w:pPr>
+            <w:r>
+              <w:rPr>
+                <w:b/>
+                <w:bCs/>
+              </w:rPr>
+              <w:t xml:space="preserve">Geführte Dokumentenerfassung</w:t>
+            </w:r>
+          </w:p>
+        </w:tc>
+        <w:tc>
+          <w:tcPr/>
+          <w:p>
+            <w:pPr>
+              <w:pStyle w:val="Compact"/>
+            </w:pPr>
+            <w:r>
+              <w:t xml:space="preserve">Berater legt förderungsspezifische Dokumenten-Checkliste an → Kunde erhält Link mit Schritt-für-Schritt-Anleitung → KI prüft ob hochgeladenes Dokument dem erwarteten Typ entspricht → Fortschrittsanzeige für Berater und Kunden</w:t>
+            </w:r>
+          </w:p>
+        </w:tc>
+        <w:tc>
+          <w:tcPr/>
+          <w:p>
+            <w:pPr>
+              <w:pStyle w:val="Compact"/>
+            </w:pPr>
+            <w:r>
+              <w:t xml:space="preserve">~6h</w:t>
+            </w:r>
+          </w:p>
+        </w:tc>
+      </w:tr>
+      <w:tr>
+        <w:tc>
+          <w:tcPr/>
+          <w:p>
+            <w:pPr>
+              <w:pStyle w:val="Compact"/>
+            </w:pPr>
+            <w:r>
+              <w:rPr>
+                <w:b/>
+                <w:bCs/>
+              </w:rPr>
+              <w:t xml:space="preserve">Digitales Energieausweis-Datenblatt</w:t>
+            </w:r>
+          </w:p>
+        </w:tc>
+        <w:tc>
+          <w:tcPr/>
+          <w:p>
+            <w:pPr>
+              <w:pStyle w:val="Compact"/>
+            </w:pPr>
+            <w:r>
+              <w:t xml:space="preserve">Online-Formular für Verbrauchs-/Bedarfsausweis-Datenerfassung durch Kunden (basierend auf bestehendem Adobe-Pro-PDF von Praczka &amp; Pinneger)</w:t>
+            </w:r>
+          </w:p>
+        </w:tc>
+        <w:tc>
+          <w:tcPr/>
+          <w:p>
+            <w:pPr>
+              <w:pStyle w:val="Compact"/>
+            </w:pPr>
+            <w:r>
+              <w:t xml:space="preserve">~2h</w:t>
+            </w:r>
+          </w:p>
+        </w:tc>
+      </w:tr>
+      <w:tr>
+        <w:tc>
+          <w:tcPr/>
+          <w:p>
+            <w:pPr>
+              <w:pStyle w:val="Compact"/>
+            </w:pPr>
+            <w:r>
+              <w:rPr>
+                <w:b/>
+                <w:bCs/>
+              </w:rPr>
+              <w:t xml:space="preserve">Baubegleitung-Checklisten</w:t>
+            </w:r>
+          </w:p>
+        </w:tc>
+        <w:tc>
+          <w:tcPr/>
+          <w:p>
+            <w:pPr>
+              <w:pStyle w:val="Compact"/>
+            </w:pPr>
+            <w:r>
+              <w:t xml:space="preserve">Digitale Abhaklisten je Projektphase (Baubegleitung) — Berater hakt Schritte ab, Fortschritt sichtbar im Dashboard</w:t>
+            </w:r>
+          </w:p>
+        </w:tc>
+        <w:tc>
+          <w:tcPr/>
+          <w:p>
+            <w:pPr>
+              <w:pStyle w:val="Compact"/>
+            </w:pPr>
+            <w:r>
+              <w:t xml:space="preserve">~3h</w:t>
+            </w:r>
+          </w:p>
+        </w:tc>
+      </w:tr>
+      <w:tr>
+        <w:tc>
+          <w:tcPr/>
+          <w:p>
+            <w:pPr>
+              <w:pStyle w:val="Compact"/>
+            </w:pPr>
+            <w:r>
+              <w:rPr>
+                <w:b/>
+                <w:bCs/>
+              </w:rPr>
+              <w:t xml:space="preserve">Kundenportal mit Login</w:t>
+            </w:r>
+          </w:p>
+        </w:tc>
+        <w:tc>
+          <w:tcPr/>
+          <w:p>
+            <w:pPr>
+              <w:pStyle w:val="Compact"/>
+            </w:pPr>
+            <w:r>
+              <w:t xml:space="preserve">Separater Kunden-Login, Projektstatus-Ansicht (read-only) — verschoben wegen Zielgruppen-Einschränkung (80% der Kunden &gt; 40 Jahre, digital wenig affin)</w:t>
+            </w:r>
+          </w:p>
+        </w:tc>
+        <w:tc>
+          <w:tcPr/>
+          <w:p>
+            <w:pPr>
+              <w:pStyle w:val="Compact"/>
+            </w:pPr>
+            <w:r>
+              <w:t xml:space="preserve">~5,5h</w:t>
             </w:r>
           </w:p>
         </w:tc>
@@ -3442,17 +3906,6 @@
             </w:r>
           </w:p>
         </w:tc>
-        <w:tc>
-          <w:tcPr/>
-          <w:p>
-            <w:pPr>
-              <w:pStyle w:val="Compact"/>
-            </w:pPr>
-            <w:r>
-              <w:t xml:space="preserve">Welle 6</w:t>
-            </w:r>
-          </w:p>
-        </w:tc>
       </w:tr>
       <w:tr>
         <w:tc>
@@ -3477,7 +3930,7 @@
               <w:pStyle w:val="Compact"/>
             </w:pPr>
             <w:r>
-              <w:t xml:space="preserve">Automatische Erstellung des individuellen Sanierungsfahrplans (iSFP) als PDF auf Basis der erfassten Gebäudedaten, KI-gestützt</w:t>
+              <w:t xml:space="preserve">Automatische Erstellung des individuellen Sanierungsfahrplans (iSFP) als PDF auf Basis der erfassten Gebäudedaten</w:t>
             </w:r>
           </w:p>
         </w:tc>
@@ -3489,17 +3942,6 @@
             </w:pPr>
             <w:r>
               <w:t xml:space="preserve">~8h</w:t>
-            </w:r>
-          </w:p>
-        </w:tc>
-        <w:tc>
-          <w:tcPr/>
-          <w:p>
-            <w:pPr>
-              <w:pStyle w:val="Compact"/>
-            </w:pPr>
-            <w:r>
-              <w:t xml:space="preserve">Welle 6</w:t>
             </w:r>
           </w:p>
         </w:tc>
@@ -3542,17 +3984,6 @@
             </w:r>
           </w:p>
         </w:tc>
-        <w:tc>
-          <w:tcPr/>
-          <w:p>
-            <w:pPr>
-              <w:pStyle w:val="Compact"/>
-            </w:pPr>
-            <w:r>
-              <w:t xml:space="preserve">Welle 6</w:t>
-            </w:r>
-          </w:p>
-        </w:tc>
       </w:tr>
       <w:tr>
         <w:tc>
@@ -3592,17 +4023,6 @@
             </w:r>
           </w:p>
         </w:tc>
-        <w:tc>
-          <w:tcPr/>
-          <w:p>
-            <w:pPr>
-              <w:pStyle w:val="Compact"/>
-            </w:pPr>
-            <w:r>
-              <w:t xml:space="preserve">Welle 7</w:t>
-            </w:r>
-          </w:p>
-        </w:tc>
       </w:tr>
       <w:tr>
         <w:tc>
@@ -3642,17 +4062,6 @@
             </w:r>
           </w:p>
         </w:tc>
-        <w:tc>
-          <w:tcPr/>
-          <w:p>
-            <w:pPr>
-              <w:pStyle w:val="Compact"/>
-            </w:pPr>
-            <w:r>
-              <w:t xml:space="preserve">Welle 7</w:t>
-            </w:r>
-          </w:p>
-        </w:tc>
       </w:tr>
       <w:tr>
         <w:tc>
@@ -3692,1131 +4101,10 @@
             </w:r>
           </w:p>
         </w:tc>
-        <w:tc>
-          <w:tcPr/>
-          <w:p>
-            <w:pPr>
-              <w:pStyle w:val="Compact"/>
-            </w:pPr>
-            <w:r>
-              <w:t xml:space="preserve">Welle 7–8</w:t>
-            </w:r>
-          </w:p>
-        </w:tc>
       </w:tr>
     </w:tbl>
-    <w:p>
-      <w:r>
-        <w:pict>
-          <v:rect style="width:0;height:1.5pt" o:hralign="center" o:hrstd="t" o:hr="t"/>
-        </w:pict>
-      </w:r>
-    </w:p>
-    <w:bookmarkStart w:id="21" w:name="vorschlag-wellen-kombinationen"/>
-    <w:p>
-      <w:pPr>
-        <w:pStyle w:val="Heading3"/>
-      </w:pPr>
-      <w:r>
-        <w:t xml:space="preserve">Vorschlag: Wellen-Kombinationen</w:t>
-      </w:r>
-    </w:p>
-    <w:tbl>
-      <w:tblPr>
-        <w:tblStyle w:val="Table"/>
-        <w:tblW w:type="pct" w:w="5000"/>
-        <w:tblLayout w:type="fixed"/>
-        <w:tblLook w:firstRow="1" w:lastRow="0" w:firstColumn="0" w:lastColumn="0" w:noHBand="0" w:noVBand="0" w:val="0020"/>
-      </w:tblPr>
-      <w:tblGrid>
-        <w:gridCol w:w="1980"/>
-        <w:gridCol w:w="1980"/>
-        <w:gridCol w:w="1980"/>
-        <w:gridCol w:w="1980"/>
-      </w:tblGrid>
-      <w:tr>
-        <w:trPr>
-          <w:tblHeader w:val="on"/>
-        </w:trPr>
-        <w:tc>
-          <w:tcPr/>
-          <w:p>
-            <w:pPr>
-              <w:pStyle w:val="Compact"/>
-            </w:pPr>
-            <w:r>
-              <w:t xml:space="preserve">Welle</w:t>
-            </w:r>
-          </w:p>
-        </w:tc>
-        <w:tc>
-          <w:tcPr/>
-          <w:p>
-            <w:pPr>
-              <w:pStyle w:val="Compact"/>
-            </w:pPr>
-            <w:r>
-              <w:t xml:space="preserve">Thema</w:t>
-            </w:r>
-          </w:p>
-        </w:tc>
-        <w:tc>
-          <w:tcPr/>
-          <w:p>
-            <w:pPr>
-              <w:pStyle w:val="Compact"/>
-            </w:pPr>
-            <w:r>
-              <w:t xml:space="preserve">Enthaltene Features</w:t>
-            </w:r>
-          </w:p>
-        </w:tc>
-        <w:tc>
-          <w:tcPr/>
-          <w:p>
-            <w:pPr>
-              <w:pStyle w:val="Compact"/>
-            </w:pPr>
-            <w:r>
-              <w:t xml:space="preserve">Geschätzte Gesamtzeit</w:t>
-            </w:r>
-          </w:p>
-        </w:tc>
-      </w:tr>
-      <w:tr>
-        <w:tc>
-          <w:tcPr/>
-          <w:p>
-            <w:pPr>
-              <w:pStyle w:val="Compact"/>
-            </w:pPr>
-            <w:r>
-              <w:rPr>
-                <w:b/>
-                <w:bCs/>
-              </w:rPr>
-              <w:t xml:space="preserve">Welle 6</w:t>
-            </w:r>
-          </w:p>
-        </w:tc>
-        <w:tc>
-          <w:tcPr/>
-          <w:p>
-            <w:pPr>
-              <w:pStyle w:val="Compact"/>
-            </w:pPr>
-            <w:r>
-              <w:t xml:space="preserve">“Automatisierung &amp; Dokumente”</w:t>
-            </w:r>
-          </w:p>
-        </w:tc>
-        <w:tc>
-          <w:tcPr/>
-          <w:p>
-            <w:pPr>
-              <w:pStyle w:val="Compact"/>
-            </w:pPr>
-            <w:r>
-              <w:t xml:space="preserve">BAFA-Live-API + iSFP-Generierung per KI + E-Rechnung</w:t>
-            </w:r>
-          </w:p>
-        </w:tc>
-        <w:tc>
-          <w:tcPr/>
-          <w:p>
-            <w:pPr>
-              <w:pStyle w:val="Compact"/>
-            </w:pPr>
-            <w:r>
-              <w:t xml:space="preserve">~16h</w:t>
-            </w:r>
-          </w:p>
-        </w:tc>
-      </w:tr>
-      <w:tr>
-        <w:tc>
-          <w:tcPr/>
-          <w:p>
-            <w:pPr>
-              <w:pStyle w:val="Compact"/>
-            </w:pPr>
-            <w:r>
-              <w:rPr>
-                <w:b/>
-                <w:bCs/>
-              </w:rPr>
-              <w:t xml:space="preserve">Welle 7</w:t>
-            </w:r>
-          </w:p>
-        </w:tc>
-        <w:tc>
-          <w:tcPr/>
-          <w:p>
-            <w:pPr>
-              <w:pStyle w:val="Compact"/>
-            </w:pPr>
-            <w:r>
-              <w:t xml:space="preserve">“Wachstum &amp; Akquise”</w:t>
-            </w:r>
-          </w:p>
-        </w:tc>
-        <w:tc>
-          <w:tcPr/>
-          <w:p>
-            <w:pPr>
-              <w:pStyle w:val="Compact"/>
-            </w:pPr>
-            <w:r>
-              <w:t xml:space="preserve">Lead-Widget + Geo-Routing + Mandantenfähigkeit Teil 1 (Einladungssystem)</w:t>
-            </w:r>
-          </w:p>
-        </w:tc>
-        <w:tc>
-          <w:tcPr/>
-          <w:p>
-            <w:pPr>
-              <w:pStyle w:val="Compact"/>
-            </w:pPr>
-            <w:r>
-              <w:t xml:space="preserve">~14–16h</w:t>
-            </w:r>
-          </w:p>
-        </w:tc>
-      </w:tr>
-      <w:tr>
-        <w:tc>
-          <w:tcPr/>
-          <w:p>
-            <w:pPr>
-              <w:pStyle w:val="Compact"/>
-            </w:pPr>
-            <w:r>
-              <w:rPr>
-                <w:b/>
-                <w:bCs/>
-              </w:rPr>
-              <w:t xml:space="preserve">Welle 8</w:t>
-            </w:r>
-          </w:p>
-        </w:tc>
-        <w:tc>
-          <w:tcPr/>
-          <w:p>
-            <w:pPr>
-              <w:pStyle w:val="Compact"/>
-            </w:pPr>
-            <w:r>
-              <w:t xml:space="preserve">“Skalierung”</w:t>
-            </w:r>
-          </w:p>
-        </w:tc>
-        <w:tc>
-          <w:tcPr/>
-          <w:p>
-            <w:pPr>
-              <w:pStyle w:val="Compact"/>
-            </w:pPr>
-            <w:r>
-              <w:t xml:space="preserve">Mandantenfähigkeit Teil 2 (Rollen, Abrechnungen) + App-Store-Veröffentlichung als PWA + Performance-Optimierung</w:t>
-            </w:r>
-          </w:p>
-        </w:tc>
-        <w:tc>
-          <w:tcPr/>
-          <w:p>
-            <w:pPr>
-              <w:pStyle w:val="Compact"/>
-            </w:pPr>
-            <w:r>
-              <w:t xml:space="preserve">~14–16h</w:t>
-            </w:r>
-          </w:p>
-        </w:tc>
-      </w:tr>
-    </w:tbl>
-    <w:p>
-      <w:pPr>
-        <w:pStyle w:val="BlockText"/>
-      </w:pPr>
-      <w:r>
-        <w:rPr>
-          <w:b/>
-          <w:bCs/>
-        </w:rPr>
-        <w:t xml:space="preserve">Empfehlung:</w:t>
-      </w:r>
-      <w:r>
-        <w:t xml:space="preserve"> </w:t>
-      </w:r>
-      <w:r>
-        <w:t xml:space="preserve">Welle 6 hat den höchsten Mehrwert für den Berater-Alltag (automatischer iSFP spart ~2h manuelle Arbeit pro Beratung) und ist ein starkes Differenzierungsmerkmal gegenüber dem Wettbewerb laut Marktanalyse.</w:t>
-      </w:r>
-    </w:p>
-    <w:p>
-      <w:r>
-        <w:pict>
-          <v:rect style="width:0;height:1.5pt" o:hralign="center" o:hrstd="t" o:hr="t"/>
-        </w:pict>
-      </w:r>
-    </w:p>
     <w:bookmarkEnd w:id="21"/>
     <w:bookmarkEnd w:id="22"/>
-    <w:bookmarkStart w:id="26" w:name="ki-funktionalitäten-parallelentwicklung"/>
-    <w:p>
-      <w:pPr>
-        <w:pStyle w:val="Heading2"/>
-      </w:pPr>
-      <w:r>
-        <w:t xml:space="preserve">14. KI-Funktionalitäten — Parallelentwicklung</w:t>
-      </w:r>
-    </w:p>
-    <w:p>
-      <w:pPr>
-        <w:pStyle w:val="BlockText"/>
-      </w:pPr>
-      <w:r>
-        <w:t xml:space="preserve">Diese Funktionen sind</w:t>
-      </w:r>
-      <w:r>
-        <w:t xml:space="preserve"> </w:t>
-      </w:r>
-      <w:r>
-        <w:rPr>
-          <w:b/>
-          <w:bCs/>
-        </w:rPr>
-        <w:t xml:space="preserve">nicht Teil von Welle 4 oder 5</w:t>
-      </w:r>
-      <w:r>
-        <w:t xml:space="preserve"> </w:t>
-      </w:r>
-      <w:r>
-        <w:t xml:space="preserve">und werden nicht im 16h-Budget berücksichtigt. Sie eignen sich für ein paralleles Entwicklerteam und können in späteren Wellen integriert werden.</w:t>
-      </w:r>
-    </w:p>
-    <w:bookmarkStart w:id="23" w:name="ki-für-den-berater-parallel-zu-welle-4"/>
-    <w:p>
-      <w:pPr>
-        <w:pStyle w:val="Heading3"/>
-      </w:pPr>
-      <w:r>
-        <w:t xml:space="preserve">14.1 KI für den Berater (parallel zu Welle 4)</w:t>
-      </w:r>
-    </w:p>
-    <w:tbl>
-      <w:tblPr>
-        <w:tblStyle w:val="Table"/>
-        <w:tblW w:type="pct" w:w="5000"/>
-        <w:tblLayout w:type="fixed"/>
-        <w:tblLook w:firstRow="1" w:lastRow="0" w:firstColumn="0" w:lastColumn="0" w:noHBand="0" w:noVBand="0" w:val="0020"/>
-      </w:tblPr>
-      <w:tblGrid>
-        <w:gridCol w:w="1980"/>
-        <w:gridCol w:w="1980"/>
-        <w:gridCol w:w="1980"/>
-        <w:gridCol w:w="1980"/>
-      </w:tblGrid>
-      <w:tr>
-        <w:trPr>
-          <w:tblHeader w:val="on"/>
-        </w:trPr>
-        <w:tc>
-          <w:tcPr/>
-          <w:p>
-            <w:pPr>
-              <w:pStyle w:val="Compact"/>
-            </w:pPr>
-            <w:r>
-              <w:t xml:space="preserve">Funktion</w:t>
-            </w:r>
-          </w:p>
-        </w:tc>
-        <w:tc>
-          <w:tcPr/>
-          <w:p>
-            <w:pPr>
-              <w:pStyle w:val="Compact"/>
-            </w:pPr>
-            <w:r>
-              <w:t xml:space="preserve">Nutzen für den Berater</w:t>
-            </w:r>
-          </w:p>
-        </w:tc>
-        <w:tc>
-          <w:tcPr/>
-          <w:p>
-            <w:pPr>
-              <w:pStyle w:val="Compact"/>
-            </w:pPr>
-            <w:r>
-              <w:t xml:space="preserve">Schätzung</w:t>
-            </w:r>
-          </w:p>
-        </w:tc>
-        <w:tc>
-          <w:tcPr/>
-          <w:p>
-            <w:pPr>
-              <w:pStyle w:val="Compact"/>
-            </w:pPr>
-            <w:r>
-              <w:t xml:space="preserve">Integrierbar ab</w:t>
-            </w:r>
-          </w:p>
-        </w:tc>
-      </w:tr>
-      <w:tr>
-        <w:tc>
-          <w:tcPr/>
-          <w:p>
-            <w:pPr>
-              <w:pStyle w:val="Compact"/>
-            </w:pPr>
-            <w:r>
-              <w:rPr>
-                <w:b/>
-                <w:bCs/>
-              </w:rPr>
-              <w:t xml:space="preserve">Smarte Formularvorschläge</w:t>
-            </w:r>
-          </w:p>
-        </w:tc>
-        <w:tc>
-          <w:tcPr/>
-          <w:p>
-            <w:pPr>
-              <w:pStyle w:val="Compact"/>
-            </w:pPr>
-            <w:r>
-              <w:t xml:space="preserve">KI schlägt Feldwerte im GEG-Formular vor (basierend auf Gebäudetyp + Baujahr) — reduziert Eingabefehler und Erfassungszeit</w:t>
-            </w:r>
-          </w:p>
-        </w:tc>
-        <w:tc>
-          <w:tcPr/>
-          <w:p>
-            <w:pPr>
-              <w:pStyle w:val="Compact"/>
-            </w:pPr>
-            <w:r>
-              <w:t xml:space="preserve">~1h</w:t>
-            </w:r>
-          </w:p>
-        </w:tc>
-        <w:tc>
-          <w:tcPr/>
-          <w:p>
-            <w:pPr>
-              <w:pStyle w:val="Compact"/>
-            </w:pPr>
-            <w:r>
-              <w:t xml:space="preserve">Welle 5</w:t>
-            </w:r>
-          </w:p>
-        </w:tc>
-      </w:tr>
-      <w:tr>
-        <w:tc>
-          <w:tcPr/>
-          <w:p>
-            <w:pPr>
-              <w:pStyle w:val="Compact"/>
-            </w:pPr>
-            <w:r>
-              <w:rPr>
-                <w:b/>
-                <w:bCs/>
-              </w:rPr>
-              <w:t xml:space="preserve">GEG-Assistent (Chatbot im Formular)</w:t>
-            </w:r>
-          </w:p>
-        </w:tc>
-        <w:tc>
-          <w:tcPr/>
-          <w:p>
-            <w:pPr>
-              <w:pStyle w:val="Compact"/>
-            </w:pPr>
-            <w:r>
-              <w:t xml:space="preserve">Kontextueller Chat-Assistent erklärt Fachbegriffe direkt im Formular (</w:t>
-            </w:r>
-            <w:r>
-              <w:t xml:space="preserve">“Was ist das Hüllflächenverhältnis?”</w:t>
-            </w:r>
-            <w:r>
-              <w:t xml:space="preserve">) — weniger Nachschlagen, schnellere Begehung</w:t>
-            </w:r>
-          </w:p>
-        </w:tc>
-        <w:tc>
-          <w:tcPr/>
-          <w:p>
-            <w:pPr>
-              <w:pStyle w:val="Compact"/>
-            </w:pPr>
-            <w:r>
-              <w:t xml:space="preserve">~1,5h</w:t>
-            </w:r>
-          </w:p>
-        </w:tc>
-        <w:tc>
-          <w:tcPr/>
-          <w:p>
-            <w:pPr>
-              <w:pStyle w:val="Compact"/>
-            </w:pPr>
-            <w:r>
-              <w:t xml:space="preserve">Welle 5</w:t>
-            </w:r>
-          </w:p>
-        </w:tc>
-      </w:tr>
-      <w:tr>
-        <w:tc>
-          <w:tcPr/>
-          <w:p>
-            <w:pPr>
-              <w:pStyle w:val="Compact"/>
-            </w:pPr>
-            <w:r>
-              <w:rPr>
-                <w:b/>
-                <w:bCs/>
-              </w:rPr>
-              <w:t xml:space="preserve">Foto-Analyse via Vision-API</w:t>
-            </w:r>
-          </w:p>
-        </w:tc>
-        <w:tc>
-          <w:tcPr/>
-          <w:p>
-            <w:pPr>
-              <w:pStyle w:val="Compact"/>
-            </w:pPr>
-            <w:r>
-              <w:t xml:space="preserve">Automatische Erkennung von Baumängeln aus Vor-Ort-Fotos (z.B. OpenAI Vision) — Berater erhält direkt Hinweise auf relevante Schwachstellen</w:t>
-            </w:r>
-          </w:p>
-        </w:tc>
-        <w:tc>
-          <w:tcPr/>
-          <w:p>
-            <w:pPr>
-              <w:pStyle w:val="Compact"/>
-            </w:pPr>
-            <w:r>
-              <w:t xml:space="preserve">~2h</w:t>
-            </w:r>
-          </w:p>
-        </w:tc>
-        <w:tc>
-          <w:tcPr/>
-          <w:p>
-            <w:pPr>
-              <w:pStyle w:val="Compact"/>
-            </w:pPr>
-            <w:r>
-              <w:t xml:space="preserve">Welle 6</w:t>
-            </w:r>
-          </w:p>
-        </w:tc>
-      </w:tr>
-      <w:tr>
-        <w:tc>
-          <w:tcPr/>
-          <w:p>
-            <w:pPr>
-              <w:pStyle w:val="Compact"/>
-            </w:pPr>
-            <w:r>
-              <w:rPr>
-                <w:b/>
-                <w:bCs/>
-              </w:rPr>
-              <w:t xml:space="preserve">OCR für Dokumente</w:t>
-            </w:r>
-          </w:p>
-        </w:tc>
-        <w:tc>
-          <w:tcPr/>
-          <w:p>
-            <w:pPr>
-              <w:pStyle w:val="Compact"/>
-            </w:pPr>
-            <w:r>
-              <w:t xml:space="preserve">Energierechnungen und Baupläne automatisch auslesen und Felder vorausfüllen — eliminiert manuelle Dateneingabe</w:t>
-            </w:r>
-          </w:p>
-        </w:tc>
-        <w:tc>
-          <w:tcPr/>
-          <w:p>
-            <w:pPr>
-              <w:pStyle w:val="Compact"/>
-            </w:pPr>
-            <w:r>
-              <w:t xml:space="preserve">~3h</w:t>
-            </w:r>
-          </w:p>
-        </w:tc>
-        <w:tc>
-          <w:tcPr/>
-          <w:p>
-            <w:pPr>
-              <w:pStyle w:val="Compact"/>
-            </w:pPr>
-            <w:r>
-              <w:t xml:space="preserve">Welle 6</w:t>
-            </w:r>
-          </w:p>
-        </w:tc>
-      </w:tr>
-    </w:tbl>
-    <w:p>
-      <w:pPr>
-        <w:pStyle w:val="BodyText"/>
-      </w:pPr>
-      <w:r>
-        <w:rPr>
-          <w:b/>
-          <w:bCs/>
-        </w:rPr>
-        <w:t xml:space="preserve">Empfehlung:</w:t>
-      </w:r>
-      <w:r>
-        <w:t xml:space="preserve"> </w:t>
-      </w:r>
-      <w:r>
-        <w:rPr>
-          <w:i/>
-          <w:iCs/>
-        </w:rPr>
-        <w:t xml:space="preserve">Formularvorschläge</w:t>
-      </w:r>
-      <w:r>
-        <w:t xml:space="preserve"> </w:t>
-      </w:r>
-      <w:r>
-        <w:t xml:space="preserve">+</w:t>
-      </w:r>
-      <w:r>
-        <w:t xml:space="preserve"> </w:t>
-      </w:r>
-      <w:r>
-        <w:rPr>
-          <w:i/>
-          <w:iCs/>
-        </w:rPr>
-        <w:t xml:space="preserve">GEG-Assistent</w:t>
-      </w:r>
-      <w:r>
-        <w:t xml:space="preserve"> </w:t>
-      </w:r>
-      <w:r>
-        <w:t xml:space="preserve">(~2,5h gesamt) haben den höchsten ROI pro Aufwandsstunde und lassen sich nahtlos in das bereits geplante GEG-Formular integrieren.</w:t>
-      </w:r>
-    </w:p>
-    <w:p>
-      <w:r>
-        <w:pict>
-          <v:rect style="width:0;height:1.5pt" o:hralign="center" o:hrstd="t" o:hr="t"/>
-        </w:pict>
-      </w:r>
-    </w:p>
-    <w:bookmarkEnd w:id="23"/>
-    <w:bookmarkStart w:id="24" w:name="ki-für-den-kunden-parallel-zu-welle-5"/>
-    <w:p>
-      <w:pPr>
-        <w:pStyle w:val="Heading3"/>
-      </w:pPr>
-      <w:r>
-        <w:t xml:space="preserve">14.2 KI für den Kunden (parallel zu Welle 5)</w:t>
-      </w:r>
-    </w:p>
-    <w:tbl>
-      <w:tblPr>
-        <w:tblStyle w:val="Table"/>
-        <w:tblW w:type="pct" w:w="5000"/>
-        <w:tblLayout w:type="fixed"/>
-        <w:tblLook w:firstRow="1" w:lastRow="0" w:firstColumn="0" w:lastColumn="0" w:noHBand="0" w:noVBand="0" w:val="0020"/>
-      </w:tblPr>
-      <w:tblGrid>
-        <w:gridCol w:w="1980"/>
-        <w:gridCol w:w="1980"/>
-        <w:gridCol w:w="1980"/>
-        <w:gridCol w:w="1980"/>
-      </w:tblGrid>
-      <w:tr>
-        <w:trPr>
-          <w:tblHeader w:val="on"/>
-        </w:trPr>
-        <w:tc>
-          <w:tcPr/>
-          <w:p>
-            <w:pPr>
-              <w:pStyle w:val="Compact"/>
-            </w:pPr>
-            <w:r>
-              <w:t xml:space="preserve">Funktion</w:t>
-            </w:r>
-          </w:p>
-        </w:tc>
-        <w:tc>
-          <w:tcPr/>
-          <w:p>
-            <w:pPr>
-              <w:pStyle w:val="Compact"/>
-            </w:pPr>
-            <w:r>
-              <w:t xml:space="preserve">Nutzen für den Kunden</w:t>
-            </w:r>
-          </w:p>
-        </w:tc>
-        <w:tc>
-          <w:tcPr/>
-          <w:p>
-            <w:pPr>
-              <w:pStyle w:val="Compact"/>
-            </w:pPr>
-            <w:r>
-              <w:t xml:space="preserve">Schätzung</w:t>
-            </w:r>
-          </w:p>
-        </w:tc>
-        <w:tc>
-          <w:tcPr/>
-          <w:p>
-            <w:pPr>
-              <w:pStyle w:val="Compact"/>
-            </w:pPr>
-            <w:r>
-              <w:t xml:space="preserve">Integrierbar ab</w:t>
-            </w:r>
-          </w:p>
-        </w:tc>
-      </w:tr>
-      <w:tr>
-        <w:tc>
-          <w:tcPr/>
-          <w:p>
-            <w:pPr>
-              <w:pStyle w:val="Compact"/>
-            </w:pPr>
-            <w:r>
-              <w:rPr>
-                <w:b/>
-                <w:bCs/>
-              </w:rPr>
-              <w:t xml:space="preserve">Förder-Erklärung in Einfachsprache</w:t>
-            </w:r>
-          </w:p>
-        </w:tc>
-        <w:tc>
-          <w:tcPr/>
-          <w:p>
-            <w:pPr>
-              <w:pStyle w:val="Compact"/>
-            </w:pPr>
-            <w:r>
-              <w:t xml:space="preserve">KI übersetzt den technischen Förder-Navigator-Output in verständliches Deutsch für Laien — höhere Kundenzufriedenheit und weniger Rückfragen an den Berater</w:t>
-            </w:r>
-          </w:p>
-        </w:tc>
-        <w:tc>
-          <w:tcPr/>
-          <w:p>
-            <w:pPr>
-              <w:pStyle w:val="Compact"/>
-            </w:pPr>
-            <w:r>
-              <w:t xml:space="preserve">~1h</w:t>
-            </w:r>
-          </w:p>
-        </w:tc>
-        <w:tc>
-          <w:tcPr/>
-          <w:p>
-            <w:pPr>
-              <w:pStyle w:val="Compact"/>
-            </w:pPr>
-            <w:r>
-              <w:t xml:space="preserve">Welle 5</w:t>
-            </w:r>
-          </w:p>
-        </w:tc>
-      </w:tr>
-      <w:tr>
-        <w:tc>
-          <w:tcPr/>
-          <w:p>
-            <w:pPr>
-              <w:pStyle w:val="Compact"/>
-            </w:pPr>
-            <w:r>
-              <w:rPr>
-                <w:b/>
-                <w:bCs/>
-              </w:rPr>
-              <w:t xml:space="preserve">Automatische Projektzusammenfassung</w:t>
-            </w:r>
-          </w:p>
-        </w:tc>
-        <w:tc>
-          <w:tcPr/>
-          <w:p>
-            <w:pPr>
-              <w:pStyle w:val="Compact"/>
-            </w:pPr>
-            <w:r>
-              <w:t xml:space="preserve">KI generiert einen lesbaren Statusbericht für den Kunden aus den Berater-Eingaben — spart dem Berater manuelle Berichtsarbeit</w:t>
-            </w:r>
-          </w:p>
-        </w:tc>
-        <w:tc>
-          <w:tcPr/>
-          <w:p>
-            <w:pPr>
-              <w:pStyle w:val="Compact"/>
-            </w:pPr>
-            <w:r>
-              <w:t xml:space="preserve">~1,5h</w:t>
-            </w:r>
-          </w:p>
-        </w:tc>
-        <w:tc>
-          <w:tcPr/>
-          <w:p>
-            <w:pPr>
-              <w:pStyle w:val="Compact"/>
-            </w:pPr>
-            <w:r>
-              <w:t xml:space="preserve">Welle 5</w:t>
-            </w:r>
-          </w:p>
-        </w:tc>
-      </w:tr>
-      <w:tr>
-        <w:tc>
-          <w:tcPr/>
-          <w:p>
-            <w:pPr>
-              <w:pStyle w:val="Compact"/>
-            </w:pPr>
-            <w:r>
-              <w:rPr>
-                <w:b/>
-                <w:bCs/>
-              </w:rPr>
-              <w:t xml:space="preserve">Kunden-Chatbot</w:t>
-            </w:r>
-          </w:p>
-        </w:tc>
-        <w:tc>
-          <w:tcPr/>
-          <w:p>
-            <w:pPr>
-              <w:pStyle w:val="Compact"/>
-            </w:pPr>
-            <w:r>
-              <w:t xml:space="preserve">Beantwortet Standardfragen zum Projektstatus auf Basis der Projektdaten (</w:t>
-            </w:r>
-            <w:r>
-              <w:t xml:space="preserve">“Wann erhalte ich meinen Bericht?”</w:t>
-            </w:r>
-            <w:r>
-              <w:t xml:space="preserve">) — entlastet den Berater von Routinekommunikation</w:t>
-            </w:r>
-          </w:p>
-        </w:tc>
-        <w:tc>
-          <w:tcPr/>
-          <w:p>
-            <w:pPr>
-              <w:pStyle w:val="Compact"/>
-            </w:pPr>
-            <w:r>
-              <w:t xml:space="preserve">~2h</w:t>
-            </w:r>
-          </w:p>
-        </w:tc>
-        <w:tc>
-          <w:tcPr/>
-          <w:p>
-            <w:pPr>
-              <w:pStyle w:val="Compact"/>
-            </w:pPr>
-            <w:r>
-              <w:t xml:space="preserve">Welle 6</w:t>
-            </w:r>
-          </w:p>
-        </w:tc>
-      </w:tr>
-      <w:tr>
-        <w:tc>
-          <w:tcPr/>
-          <w:p>
-            <w:pPr>
-              <w:pStyle w:val="Compact"/>
-            </w:pPr>
-            <w:r>
-              <w:rPr>
-                <w:b/>
-                <w:bCs/>
-              </w:rPr>
-              <w:t xml:space="preserve">Renovierungs-Roadmap</w:t>
-            </w:r>
-          </w:p>
-        </w:tc>
-        <w:tc>
-          <w:tcPr/>
-          <w:p>
-            <w:pPr>
-              <w:pStyle w:val="Compact"/>
-            </w:pPr>
-            <w:r>
-              <w:t xml:space="preserve">KI erstellt eine priorisierte Maßnahmenliste basierend auf Gebäudedaten und Kundenbudget — zentraler USP der App gegenüber dem Wettbewerb</w:t>
-            </w:r>
-          </w:p>
-        </w:tc>
-        <w:tc>
-          <w:tcPr/>
-          <w:p>
-            <w:pPr>
-              <w:pStyle w:val="Compact"/>
-            </w:pPr>
-            <w:r>
-              <w:t xml:space="preserve">~2h</w:t>
-            </w:r>
-          </w:p>
-        </w:tc>
-        <w:tc>
-          <w:tcPr/>
-          <w:p>
-            <w:pPr>
-              <w:pStyle w:val="Compact"/>
-            </w:pPr>
-            <w:r>
-              <w:t xml:space="preserve">Welle 6</w:t>
-            </w:r>
-          </w:p>
-        </w:tc>
-      </w:tr>
-    </w:tbl>
-    <w:p>
-      <w:pPr>
-        <w:pStyle w:val="BodyText"/>
-      </w:pPr>
-      <w:r>
-        <w:rPr>
-          <w:b/>
-          <w:bCs/>
-        </w:rPr>
-        <w:t xml:space="preserve">Empfehlung:</w:t>
-      </w:r>
-      <w:r>
-        <w:t xml:space="preserve"> </w:t>
-      </w:r>
-      <w:r>
-        <w:rPr>
-          <w:i/>
-          <w:iCs/>
-        </w:rPr>
-        <w:t xml:space="preserve">Förder-Erklärung in Einfachsprache</w:t>
-      </w:r>
-      <w:r>
-        <w:t xml:space="preserve"> </w:t>
-      </w:r>
-      <w:r>
-        <w:t xml:space="preserve">+</w:t>
-      </w:r>
-      <w:r>
-        <w:t xml:space="preserve"> </w:t>
-      </w:r>
-      <w:r>
-        <w:rPr>
-          <w:i/>
-          <w:iCs/>
-        </w:rPr>
-        <w:t xml:space="preserve">Automatische Projektzusammenfassung</w:t>
-      </w:r>
-      <w:r>
-        <w:t xml:space="preserve"> </w:t>
-      </w:r>
-      <w:r>
-        <w:t xml:space="preserve">(~2,5h gesamt) nutzen die in Welle 5 bereits vorhandenen Daten optimal und sind direkt integrierbar.</w:t>
-      </w:r>
-    </w:p>
-    <w:p>
-      <w:r>
-        <w:pict>
-          <v:rect style="width:0;height:1.5pt" o:hralign="center" o:hrstd="t" o:hr="t"/>
-        </w:pict>
-      </w:r>
-    </w:p>
-    <w:bookmarkEnd w:id="24"/>
-    <w:bookmarkStart w:id="25" w:name="technische-basis-für-alle-ki-funktionen"/>
-    <w:p>
-      <w:pPr>
-        <w:pStyle w:val="Heading3"/>
-      </w:pPr>
-      <w:r>
-        <w:t xml:space="preserve">14.3 Technische Basis für alle KI-Funktionen</w:t>
-      </w:r>
-    </w:p>
-    <w:tbl>
-      <w:tblPr>
-        <w:tblStyle w:val="Table"/>
-        <w:tblW w:type="pct" w:w="5000"/>
-        <w:tblLayout w:type="fixed"/>
-        <w:tblLook w:firstRow="1" w:lastRow="0" w:firstColumn="0" w:lastColumn="0" w:noHBand="0" w:noVBand="0" w:val="0020"/>
-      </w:tblPr>
-      <w:tblGrid>
-        <w:gridCol w:w="3960"/>
-        <w:gridCol w:w="3960"/>
-      </w:tblGrid>
-      <w:tr>
-        <w:trPr>
-          <w:tblHeader w:val="on"/>
-        </w:trPr>
-        <w:tc>
-          <w:tcPr/>
-          <w:p>
-            <w:pPr>
-              <w:pStyle w:val="Compact"/>
-            </w:pPr>
-            <w:r>
-              <w:t xml:space="preserve">Aspekt</w:t>
-            </w:r>
-          </w:p>
-        </w:tc>
-        <w:tc>
-          <w:tcPr/>
-          <w:p>
-            <w:pPr>
-              <w:pStyle w:val="Compact"/>
-            </w:pPr>
-            <w:r>
-              <w:t xml:space="preserve">Entscheidung</w:t>
-            </w:r>
-          </w:p>
-        </w:tc>
-      </w:tr>
-      <w:tr>
-        <w:tc>
-          <w:tcPr/>
-          <w:p>
-            <w:pPr>
-              <w:pStyle w:val="Compact"/>
-            </w:pPr>
-            <w:r>
-              <w:rPr>
-                <w:b/>
-                <w:bCs/>
-              </w:rPr>
-              <w:t xml:space="preserve">KI-Provider</w:t>
-            </w:r>
-          </w:p>
-        </w:tc>
-        <w:tc>
-          <w:tcPr/>
-          <w:p>
-            <w:pPr>
-              <w:pStyle w:val="Compact"/>
-            </w:pPr>
-            <w:r>
-              <w:t xml:space="preserve">OpenAI API (GPT-4o / GPT-4o-mini je nach Kostenanforderung)</w:t>
-            </w:r>
-          </w:p>
-        </w:tc>
-      </w:tr>
-      <w:tr>
-        <w:tc>
-          <w:tcPr/>
-          <w:p>
-            <w:pPr>
-              <w:pStyle w:val="Compact"/>
-            </w:pPr>
-            <w:r>
-              <w:rPr>
-                <w:b/>
-                <w:bCs/>
-              </w:rPr>
-              <w:t xml:space="preserve">Integration</w:t>
-            </w:r>
-          </w:p>
-        </w:tc>
-        <w:tc>
-          <w:tcPr/>
-          <w:p>
-            <w:pPr>
-              <w:pStyle w:val="Compact"/>
-            </w:pPr>
-            <w:r>
-              <w:t xml:space="preserve">Server-Side API-Route in Next.js (kein API-Key im Frontend)</w:t>
-            </w:r>
-          </w:p>
-        </w:tc>
-      </w:tr>
-      <w:tr>
-        <w:tc>
-          <w:tcPr/>
-          <w:p>
-            <w:pPr>
-              <w:pStyle w:val="Compact"/>
-            </w:pPr>
-            <w:r>
-              <w:rPr>
-                <w:b/>
-                <w:bCs/>
-              </w:rPr>
-              <w:t xml:space="preserve">Datenschutz</w:t>
-            </w:r>
-          </w:p>
-        </w:tc>
-        <w:tc>
-          <w:tcPr/>
-          <w:p>
-            <w:pPr>
-              <w:pStyle w:val="Compact"/>
-            </w:pPr>
-            <w:r>
-              <w:t xml:space="preserve">Keine personenbezogenen Daten an OpenAI — nur strukturierte Gebäudedaten und anonymisierte Projektinfos</w:t>
-            </w:r>
-          </w:p>
-        </w:tc>
-      </w:tr>
-      <w:tr>
-        <w:tc>
-          <w:tcPr/>
-          <w:p>
-            <w:pPr>
-              <w:pStyle w:val="Compact"/>
-            </w:pPr>
-            <w:r>
-              <w:rPr>
-                <w:b/>
-                <w:bCs/>
-              </w:rPr>
-              <w:t xml:space="preserve">Kosten</w:t>
-            </w:r>
-          </w:p>
-        </w:tc>
-        <w:tc>
-          <w:tcPr/>
-          <w:p>
-            <w:pPr>
-              <w:pStyle w:val="Compact"/>
-            </w:pPr>
-            <w:r>
-              <w:t xml:space="preserve">GPT-4o-mini: ~0,15 USD / 1M Input-Token — bei &lt; 100 Nutzern vernachlässigbar</w:t>
-            </w:r>
-          </w:p>
-        </w:tc>
-      </w:tr>
-    </w:tbl>
-    <w:bookmarkEnd w:id="25"/>
-    <w:bookmarkEnd w:id="26"/>
-    <w:bookmarkEnd w:id="27"/>
     <w:sectPr>
       <w:footnotePr>
         <w:numRestart w:val="eachSect"/>
@@ -5016,6 +4304,36 @@
     <w:abstractNumId w:val="990"/>
   </w:num>
   <w:num w:numId="1001">
+    <w:abstractNumId w:val="99411"/>
+    <w:lvlOverride w:ilvl="0">
+      <w:startOverride w:val="1"/>
+    </w:lvlOverride>
+    <w:lvlOverride w:ilvl="1">
+      <w:startOverride w:val="1"/>
+    </w:lvlOverride>
+    <w:lvlOverride w:ilvl="2">
+      <w:startOverride w:val="1"/>
+    </w:lvlOverride>
+    <w:lvlOverride w:ilvl="3">
+      <w:startOverride w:val="1"/>
+    </w:lvlOverride>
+    <w:lvlOverride w:ilvl="4">
+      <w:startOverride w:val="1"/>
+    </w:lvlOverride>
+    <w:lvlOverride w:ilvl="5">
+      <w:startOverride w:val="1"/>
+    </w:lvlOverride>
+    <w:lvlOverride w:ilvl="6">
+      <w:startOverride w:val="1"/>
+    </w:lvlOverride>
+    <w:lvlOverride w:ilvl="7">
+      <w:startOverride w:val="1"/>
+    </w:lvlOverride>
+    <w:lvlOverride w:ilvl="8">
+      <w:startOverride w:val="1"/>
+    </w:lvlOverride>
+  </w:num>
+  <w:num w:numId="1002">
     <w:abstractNumId w:val="99411"/>
     <w:lvlOverride w:ilvl="0">
       <w:startOverride w:val="1"/>
@@ -5704,7 +5022,7 @@
       <w:color w:themeColor="accent1" w:themeShade="BF" w:val="365F91"/>
     </w:rPr>
   </w:style>
-  <w:style w:type="paragraph" w:customStyle="1" w:styleId="SourceCode">
+  <w:style w:customStyle="1" w:styleId="SourceCode" w:type="paragraph">
     <w:name w:val="Source Code"/>
     <w:basedOn w:val="Normal"/>
     <w:link w:val="VerbatimChar"/>
@@ -5712,7 +5030,7 @@
       <w:wordWrap w:val="off"/>
     </w:pPr>
   </w:style>
-  <w:style w:type="character" w:customStyle="1" w:styleId="KeywordTok">
+  <w:style w:customStyle="1" w:styleId="KeywordTok" w:type="character">
     <w:name w:val="KeywordTok"/>
     <w:basedOn w:val="VerbatimChar"/>
     <w:rPr>
@@ -5720,77 +5038,77 @@
       <w:color w:val="007020"/>
     </w:rPr>
   </w:style>
-  <w:style w:type="character" w:customStyle="1" w:styleId="DataTypeTok">
+  <w:style w:customStyle="1" w:styleId="DataTypeTok" w:type="character">
     <w:name w:val="DataTypeTok"/>
     <w:basedOn w:val="VerbatimChar"/>
     <w:rPr>
       <w:color w:val="902000"/>
     </w:rPr>
   </w:style>
-  <w:style w:type="character" w:customStyle="1" w:styleId="DecValTok">
+  <w:style w:customStyle="1" w:styleId="DecValTok" w:type="character">
     <w:name w:val="DecValTok"/>
     <w:basedOn w:val="VerbatimChar"/>
     <w:rPr>
       <w:color w:val="40a070"/>
     </w:rPr>
   </w:style>
-  <w:style w:type="character" w:customStyle="1" w:styleId="BaseNTok">
+  <w:style w:customStyle="1" w:styleId="BaseNTok" w:type="character">
     <w:name w:val="BaseNTok"/>
     <w:basedOn w:val="VerbatimChar"/>
     <w:rPr>
       <w:color w:val="40a070"/>
     </w:rPr>
   </w:style>
-  <w:style w:type="character" w:customStyle="1" w:styleId="FloatTok">
+  <w:style w:customStyle="1" w:styleId="FloatTok" w:type="character">
     <w:name w:val="FloatTok"/>
     <w:basedOn w:val="VerbatimChar"/>
     <w:rPr>
       <w:color w:val="40a070"/>
     </w:rPr>
   </w:style>
-  <w:style w:type="character" w:customStyle="1" w:styleId="ConstantTok">
+  <w:style w:customStyle="1" w:styleId="ConstantTok" w:type="character">
     <w:name w:val="ConstantTok"/>
     <w:basedOn w:val="VerbatimChar"/>
     <w:rPr>
       <w:color w:val="880000"/>
     </w:rPr>
   </w:style>
-  <w:style w:type="character" w:customStyle="1" w:styleId="CharTok">
+  <w:style w:customStyle="1" w:styleId="CharTok" w:type="character">
     <w:name w:val="CharTok"/>
     <w:basedOn w:val="VerbatimChar"/>
     <w:rPr>
       <w:color w:val="4070a0"/>
     </w:rPr>
   </w:style>
-  <w:style w:type="character" w:customStyle="1" w:styleId="SpecialCharTok">
+  <w:style w:customStyle="1" w:styleId="SpecialCharTok" w:type="character">
     <w:name w:val="SpecialCharTok"/>
     <w:basedOn w:val="VerbatimChar"/>
     <w:rPr>
       <w:color w:val="4070a0"/>
     </w:rPr>
   </w:style>
-  <w:style w:type="character" w:customStyle="1" w:styleId="StringTok">
+  <w:style w:customStyle="1" w:styleId="StringTok" w:type="character">
     <w:name w:val="StringTok"/>
     <w:basedOn w:val="VerbatimChar"/>
     <w:rPr>
       <w:color w:val="4070a0"/>
     </w:rPr>
   </w:style>
-  <w:style w:type="character" w:customStyle="1" w:styleId="VerbatimStringTok">
+  <w:style w:customStyle="1" w:styleId="VerbatimStringTok" w:type="character">
     <w:name w:val="VerbatimStringTok"/>
     <w:basedOn w:val="VerbatimChar"/>
     <w:rPr>
       <w:color w:val="4070a0"/>
     </w:rPr>
   </w:style>
-  <w:style w:type="character" w:customStyle="1" w:styleId="SpecialStringTok">
+  <w:style w:customStyle="1" w:styleId="SpecialStringTok" w:type="character">
     <w:name w:val="SpecialStringTok"/>
     <w:basedOn w:val="VerbatimChar"/>
     <w:rPr>
       <w:color w:val="bb6688"/>
     </w:rPr>
   </w:style>
-  <w:style w:type="character" w:customStyle="1" w:styleId="ImportTok">
+  <w:style w:customStyle="1" w:styleId="ImportTok" w:type="character">
     <w:name w:val="ImportTok"/>
     <w:basedOn w:val="VerbatimChar"/>
     <w:rPr>
@@ -5798,7 +5116,7 @@
       <w:color w:val="008000"/>
     </w:rPr>
   </w:style>
-  <w:style w:type="character" w:customStyle="1" w:styleId="CommentTok">
+  <w:style w:customStyle="1" w:styleId="CommentTok" w:type="character">
     <w:name w:val="CommentTok"/>
     <w:basedOn w:val="VerbatimChar"/>
     <w:rPr>
@@ -5806,7 +5124,7 @@
       <w:color w:val="60a0b0"/>
     </w:rPr>
   </w:style>
-  <w:style w:type="character" w:customStyle="1" w:styleId="DocumentationTok">
+  <w:style w:customStyle="1" w:styleId="DocumentationTok" w:type="character">
     <w:name w:val="DocumentationTok"/>
     <w:basedOn w:val="VerbatimChar"/>
     <w:rPr>
@@ -5814,7 +5132,7 @@
       <w:color w:val="ba2121"/>
     </w:rPr>
   </w:style>
-  <w:style w:type="character" w:customStyle="1" w:styleId="AnnotationTok">
+  <w:style w:customStyle="1" w:styleId="AnnotationTok" w:type="character">
     <w:name w:val="AnnotationTok"/>
     <w:basedOn w:val="VerbatimChar"/>
     <w:rPr>
@@ -5823,7 +5141,7 @@
       <w:color w:val="60a0b0"/>
     </w:rPr>
   </w:style>
-  <w:style w:type="character" w:customStyle="1" w:styleId="CommentVarTok">
+  <w:style w:customStyle="1" w:styleId="CommentVarTok" w:type="character">
     <w:name w:val="CommentVarTok"/>
     <w:basedOn w:val="VerbatimChar"/>
     <w:rPr>
@@ -5832,28 +5150,28 @@
       <w:color w:val="60a0b0"/>
     </w:rPr>
   </w:style>
-  <w:style w:type="character" w:customStyle="1" w:styleId="OtherTok">
+  <w:style w:customStyle="1" w:styleId="OtherTok" w:type="character">
     <w:name w:val="OtherTok"/>
     <w:basedOn w:val="VerbatimChar"/>
     <w:rPr>
       <w:color w:val="007020"/>
     </w:rPr>
   </w:style>
-  <w:style w:type="character" w:customStyle="1" w:styleId="FunctionTok">
+  <w:style w:customStyle="1" w:styleId="FunctionTok" w:type="character">
     <w:name w:val="FunctionTok"/>
     <w:basedOn w:val="VerbatimChar"/>
     <w:rPr>
       <w:color w:val="06287e"/>
     </w:rPr>
   </w:style>
-  <w:style w:type="character" w:customStyle="1" w:styleId="VariableTok">
+  <w:style w:customStyle="1" w:styleId="VariableTok" w:type="character">
     <w:name w:val="VariableTok"/>
     <w:basedOn w:val="VerbatimChar"/>
     <w:rPr>
       <w:color w:val="19177c"/>
     </w:rPr>
   </w:style>
-  <w:style w:type="character" w:customStyle="1" w:styleId="ControlFlowTok">
+  <w:style w:customStyle="1" w:styleId="ControlFlowTok" w:type="character">
     <w:name w:val="ControlFlowTok"/>
     <w:basedOn w:val="VerbatimChar"/>
     <w:rPr>
@@ -5861,45 +5179,45 @@
       <w:color w:val="007020"/>
     </w:rPr>
   </w:style>
-  <w:style w:type="character" w:customStyle="1" w:styleId="OperatorTok">
+  <w:style w:customStyle="1" w:styleId="OperatorTok" w:type="character">
     <w:name w:val="OperatorTok"/>
     <w:basedOn w:val="VerbatimChar"/>
     <w:rPr>
       <w:color w:val="666666"/>
     </w:rPr>
   </w:style>
-  <w:style w:type="character" w:customStyle="1" w:styleId="BuiltInTok">
+  <w:style w:customStyle="1" w:styleId="BuiltInTok" w:type="character">
     <w:name w:val="BuiltInTok"/>
     <w:basedOn w:val="VerbatimChar"/>
     <w:rPr>
       <w:color w:val="008000"/>
     </w:rPr>
   </w:style>
-  <w:style w:type="character" w:customStyle="1" w:styleId="ExtensionTok">
+  <w:style w:customStyle="1" w:styleId="ExtensionTok" w:type="character">
     <w:name w:val="ExtensionTok"/>
     <w:basedOn w:val="VerbatimChar"/>
     <w:rPr/>
   </w:style>
-  <w:style w:type="character" w:customStyle="1" w:styleId="PreprocessorTok">
+  <w:style w:customStyle="1" w:styleId="PreprocessorTok" w:type="character">
     <w:name w:val="PreprocessorTok"/>
     <w:basedOn w:val="VerbatimChar"/>
     <w:rPr>
       <w:color w:val="bc7a00"/>
     </w:rPr>
   </w:style>
-  <w:style w:type="character" w:customStyle="1" w:styleId="AttributeTok">
+  <w:style w:customStyle="1" w:styleId="AttributeTok" w:type="character">
     <w:name w:val="AttributeTok"/>
     <w:basedOn w:val="VerbatimChar"/>
     <w:rPr>
       <w:color w:val="7d9029"/>
     </w:rPr>
   </w:style>
-  <w:style w:type="character" w:customStyle="1" w:styleId="RegionMarkerTok">
+  <w:style w:customStyle="1" w:styleId="RegionMarkerTok" w:type="character">
     <w:name w:val="RegionMarkerTok"/>
     <w:basedOn w:val="VerbatimChar"/>
     <w:rPr/>
   </w:style>
-  <w:style w:type="character" w:customStyle="1" w:styleId="InformationTok">
+  <w:style w:customStyle="1" w:styleId="InformationTok" w:type="character">
     <w:name w:val="InformationTok"/>
     <w:basedOn w:val="VerbatimChar"/>
     <w:rPr>
@@ -5908,7 +5226,7 @@
       <w:color w:val="60a0b0"/>
     </w:rPr>
   </w:style>
-  <w:style w:type="character" w:customStyle="1" w:styleId="WarningTok">
+  <w:style w:customStyle="1" w:styleId="WarningTok" w:type="character">
     <w:name w:val="WarningTok"/>
     <w:basedOn w:val="VerbatimChar"/>
     <w:rPr>
@@ -5917,7 +5235,7 @@
       <w:color w:val="60a0b0"/>
     </w:rPr>
   </w:style>
-  <w:style w:type="character" w:customStyle="1" w:styleId="AlertTok">
+  <w:style w:customStyle="1" w:styleId="AlertTok" w:type="character">
     <w:name w:val="AlertTok"/>
     <w:basedOn w:val="VerbatimChar"/>
     <w:rPr>
@@ -5925,7 +5243,7 @@
       <w:color w:val="ff0000"/>
     </w:rPr>
   </w:style>
-  <w:style w:type="character" w:customStyle="1" w:styleId="ErrorTok">
+  <w:style w:customStyle="1" w:styleId="ErrorTok" w:type="character">
     <w:name w:val="ErrorTok"/>
     <w:basedOn w:val="VerbatimChar"/>
     <w:rPr>
@@ -5933,7 +5251,7 @@
       <w:color w:val="ff0000"/>
     </w:rPr>
   </w:style>
-  <w:style w:type="character" w:customStyle="1" w:styleId="NormalTok">
+  <w:style w:customStyle="1" w:styleId="NormalTok" w:type="character">
     <w:name w:val="NormalTok"/>
     <w:basedOn w:val="VerbatimChar"/>
     <w:rPr/>

</xml_diff>